<commit_message>
Retire the old project name across the repository and guard against its return
</commit_message>
<xml_diff>
--- a/frontiers/manuscript.docx
+++ b/frontiers/manuscript.docx
@@ -8310,7 +8310,21 @@
           <w:i/>
           <w:iCs/>
         </w:rPr>
-        <w:t xml:space="preserve">Disclosed Intelligence: Reproducibility Capsule</w:t>
+        <w:t xml:space="preserve">AI</w:t>
+      </w:r>
+      <w:r>
+        <w:rPr>
+          <w:i/>
+          <w:iCs/>
+        </w:rPr>
+        <w:t xml:space="preserve"> </w:t>
+      </w:r>
+      <w:r>
+        <w:rPr>
+          <w:i/>
+          <w:iCs/>
+        </w:rPr>
+        <w:t xml:space="preserve">Use and Risk Disclosure by Investment Advisers: Reproducibility Capsule</w:t>
       </w:r>
       <w:r>
         <w:t xml:space="preserve">. Code Ocean.</w:t>

</xml_diff>

<commit_message>
Cite Code Ocean capsule v2
The capsule was republished from the current pipeline. Every live reference now
points at 10.24433/CO.3404788.v2: the manuscript's Data and Code Availability
statement, references.bib, CITATION.cff, DATA_AVAILABILITY.md, the repository
and capsule READMEs, and both metadata files.

The as-submitted record under frontiers/submission/ keeps v1, which is the DOI
the reviewers were given; the tracked-changes build marks the bump as a change.
</commit_message>
<xml_diff>
--- a/frontiers/manuscript.docx
+++ b/frontiers/manuscript.docx
@@ -3436,7 +3436,7 @@
           <w:rPr>
             <w:rStyle w:val="Hyperlink"/>
           </w:rPr>
-          <w:t xml:space="preserve">https://doi.org/10.24433/CO.3404788.v1</w:t>
+          <w:t xml:space="preserve">https://doi.org/10.24433/CO.3404788.v2</w:t>
         </w:r>
       </w:hyperlink>
       <w:r>
@@ -8337,7 +8337,7 @@
           <w:rPr>
             <w:rStyle w:val="Hyperlink"/>
           </w:rPr>
-          <w:t xml:space="preserve">https://doi.org/10.24433/CO.3404788.v1</w:t>
+          <w:t xml:space="preserve">https://doi.org/10.24433/CO.3404788.v2</w:t>
         </w:r>
       </w:hyperlink>
       <w:r>

</xml_diff>